<commit_message>
docs: update categorização de ouvidorias e manual de contagem de reclamações
Co-Authored-By: Claude Sonnet 4.6 <noreply@anthropic.com>
</commit_message>
<xml_diff>
--- a/Manual_Contagem de Reclamações.docx
+++ b/Manual_Contagem de Reclamações.docx
@@ -52,40 +52,7 @@
           <w:sz w:val="34"/>
           <w:szCs w:val="34"/>
         </w:rPr>
-        <w:t xml:space="preserve">CONTAGEM DE </w:t>
-      </w:r>
-      <w:r>
-        <w:rPr>
-          <w:b/>
-          <w:bCs/>
-          <w:caps/>
-          <w:color w:val="1F3864"/>
-          <w:sz w:val="34"/>
-          <w:szCs w:val="34"/>
-        </w:rPr>
-        <w:t>FATOS GERADORES</w:t>
-      </w:r>
-      <w:r>
-        <w:rPr>
-          <w:b/>
-          <w:bCs/>
-          <w:caps/>
-          <w:color w:val="1F3864"/>
-          <w:sz w:val="34"/>
-          <w:szCs w:val="34"/>
-        </w:rPr>
-        <w:t xml:space="preserve"> E </w:t>
-      </w:r>
-      <w:r>
-        <w:rPr>
-          <w:b/>
-          <w:bCs/>
-          <w:caps/>
-          <w:color w:val="1F3864"/>
-          <w:sz w:val="34"/>
-          <w:szCs w:val="34"/>
-        </w:rPr>
-        <w:t>CATEGORIZAÇÃO</w:t>
+        <w:t>CONTAGEM DE FATOS GERADORES E CATEGORIZAÇÃO</w:t>
       </w:r>
     </w:p>
     <w:p>
@@ -323,21 +290,7 @@
         <w:rPr>
           <w:color w:val="000000"/>
         </w:rPr>
-        <w:t xml:space="preserve">Antes de </w:t>
-      </w:r>
-      <w:proofErr w:type="gramStart"/>
-      <w:r>
-        <w:rPr>
-          <w:color w:val="000000"/>
-        </w:rPr>
-        <w:t>criar uma nova</w:t>
-      </w:r>
-      <w:proofErr w:type="gramEnd"/>
-      <w:r>
-        <w:rPr>
-          <w:color w:val="000000"/>
-        </w:rPr>
-        <w:t xml:space="preserve"> categorização, o analista deve se fazer a seguinte pergunta:</w:t>
+        <w:t>Antes de criar uma nova categorização, o analista deve se fazer a seguinte pergunta:</w:t>
       </w:r>
     </w:p>
     <w:tbl>
@@ -504,12 +457,31 @@
     </w:p>
     <w:p>
       <w:pPr>
-        <w:pStyle w:val="Ttulo1"/>
+        <w:rPr>
+          <w:b/>
+          <w:bCs/>
+          <w:caps/>
+          <w:color w:val="1F3864"/>
+          <w:sz w:val="30"/>
+          <w:szCs w:val="30"/>
+        </w:rPr>
       </w:pPr>
       <w:r>
         <w:rPr>
           <w:caps/>
         </w:rPr>
+        <w:br w:type="page"/>
+      </w:r>
+    </w:p>
+    <w:p>
+      <w:pPr>
+        <w:pStyle w:val="Ttulo1"/>
+      </w:pPr>
+      <w:r>
+        <w:rPr>
+          <w:caps/>
+        </w:rPr>
+        <w:lastRenderedPageBreak/>
         <w:t>3. Regra de Causalidade — Priorizar o Fato Gerador</w:t>
       </w:r>
     </w:p>
@@ -522,7 +494,6 @@
         <w:rPr>
           <w:color w:val="000000"/>
         </w:rPr>
-        <w:lastRenderedPageBreak/>
         <w:t>Quando o relato indicar claramente a origem do problema, deve-se registrar prioritariamente o fato gerador principal, evitando duplicidade. O analista deve identificar a estrutura:</w:t>
       </w:r>
     </w:p>
@@ -1797,35 +1768,7 @@
         <w:rPr>
           <w:color w:val="000000"/>
         </w:rPr>
-        <w:t xml:space="preserve">Não se </w:t>
-      </w:r>
-      <w:proofErr w:type="gramStart"/>
-      <w:r>
-        <w:rPr>
-          <w:color w:val="000000"/>
-        </w:rPr>
-        <w:t>cria nova</w:t>
-      </w:r>
-      <w:proofErr w:type="gramEnd"/>
-      <w:r>
-        <w:rPr>
-          <w:color w:val="000000"/>
-        </w:rPr>
-        <w:t xml:space="preserve"> reclamação porque o cidadão sofreu mais danos. </w:t>
-      </w:r>
-      <w:proofErr w:type="gramStart"/>
-      <w:r>
-        <w:rPr>
-          <w:color w:val="000000"/>
-        </w:rPr>
-        <w:t>Cria-se nova</w:t>
-      </w:r>
-      <w:proofErr w:type="gramEnd"/>
-      <w:r>
-        <w:rPr>
-          <w:color w:val="000000"/>
-        </w:rPr>
-        <w:t xml:space="preserve"> reclamação quando a empresa pratica novo comportamento apurável.</w:t>
+        <w:t>Não se cria nova reclamação porque o cidadão sofreu mais danos. Cria-se nova reclamação quando a empresa pratica novo comportamento apurável.</w:t>
       </w:r>
     </w:p>
     <w:p>
@@ -2538,7 +2481,79 @@
                 <w:sz w:val="20"/>
                 <w:szCs w:val="20"/>
               </w:rPr>
-              <w:t>"Tentei comprar a passagem. Informaram que aceitavam a venda. Depois disseram que só aceitavam dinheiro. Consegui dinheiro, mas depois recusaram também o pagamento em espécie e fui impedido de viajar."</w:t>
+              <w:t>"Tentei comprar a passagem</w:t>
+            </w:r>
+            <w:r>
+              <w:rPr>
+                <w:i/>
+                <w:iCs/>
+                <w:sz w:val="20"/>
+                <w:szCs w:val="20"/>
+              </w:rPr>
+              <w:t xml:space="preserve"> e me i</w:t>
+            </w:r>
+            <w:r>
+              <w:rPr>
+                <w:i/>
+                <w:iCs/>
+                <w:sz w:val="20"/>
+                <w:szCs w:val="20"/>
+              </w:rPr>
+              <w:t xml:space="preserve">nformaram que </w:t>
+            </w:r>
+            <w:r>
+              <w:rPr>
+                <w:i/>
+                <w:iCs/>
+                <w:sz w:val="20"/>
+                <w:szCs w:val="20"/>
+              </w:rPr>
+              <w:t xml:space="preserve">não </w:t>
+            </w:r>
+            <w:r>
+              <w:rPr>
+                <w:i/>
+                <w:iCs/>
+                <w:sz w:val="20"/>
+                <w:szCs w:val="20"/>
+              </w:rPr>
+              <w:t xml:space="preserve">aceitavam </w:t>
+            </w:r>
+            <w:r>
+              <w:rPr>
+                <w:i/>
+                <w:iCs/>
+                <w:sz w:val="20"/>
+                <w:szCs w:val="20"/>
+              </w:rPr>
+              <w:t>Pix</w:t>
+            </w:r>
+            <w:r>
+              <w:rPr>
+                <w:i/>
+                <w:iCs/>
+                <w:sz w:val="20"/>
+                <w:szCs w:val="20"/>
+              </w:rPr>
+              <w:t xml:space="preserve">. </w:t>
+            </w:r>
+            <w:r>
+              <w:rPr>
+                <w:i/>
+                <w:iCs/>
+                <w:sz w:val="20"/>
+                <w:szCs w:val="20"/>
+              </w:rPr>
+              <w:t xml:space="preserve">Me </w:t>
+            </w:r>
+            <w:r>
+              <w:rPr>
+                <w:i/>
+                <w:iCs/>
+                <w:sz w:val="20"/>
+                <w:szCs w:val="20"/>
+              </w:rPr>
+              <w:t>disseram que só aceitavam dinheiro. Consegui dinheiro, mas depois recusaram também o pagamento em espécie e fui impedido de viajar."</w:t>
             </w:r>
           </w:p>
         </w:tc>
@@ -3683,7 +3698,10 @@
     </w:tbl>
     <w:p>
       <w:pPr>
-        <w:spacing w:after="240"/>
+        <w:pStyle w:val="Ttulo1"/>
+        <w:rPr>
+          <w:caps/>
+        </w:rPr>
       </w:pPr>
     </w:p>
     <w:p>
@@ -4913,7 +4931,52 @@
                 <w:sz w:val="20"/>
                 <w:szCs w:val="20"/>
               </w:rPr>
-              <w:t>"O motorista disse que aceitava Pix. Depois informou que somente dinheiro. Consegui dinheiro, mas recusaram a venda e fui impedido de viajar."</w:t>
+              <w:t>"</w:t>
+            </w:r>
+            <w:r>
+              <w:rPr>
+                <w:i/>
+                <w:iCs/>
+                <w:sz w:val="20"/>
+                <w:szCs w:val="20"/>
+              </w:rPr>
+              <w:t>Atendente</w:t>
+            </w:r>
+            <w:r>
+              <w:rPr>
+                <w:i/>
+                <w:iCs/>
+                <w:sz w:val="20"/>
+                <w:szCs w:val="20"/>
+              </w:rPr>
+              <w:t xml:space="preserve"> se nega a me dar minha passagem com gratuidade, já compareci </w:t>
+            </w:r>
+            <w:r>
+              <w:rPr>
+                <w:i/>
+                <w:iCs/>
+                <w:sz w:val="20"/>
+                <w:szCs w:val="20"/>
+              </w:rPr>
+              <w:t>várias</w:t>
+            </w:r>
+            <w:r>
+              <w:rPr>
+                <w:i/>
+                <w:iCs/>
+                <w:sz w:val="20"/>
+                <w:szCs w:val="20"/>
+              </w:rPr>
+              <w:t xml:space="preserve"> vezes à rodoviária, na primeira vez me disseram que eu tinha que voltar no dia seguinte, pois não tinha vaga. No dia seguinte, me disseram de novo que não tinha vaga e me falaram para voltar no outro dia. Exigi que me fosse dada a gratuidade e me foi negado.</w:t>
+            </w:r>
+            <w:r>
+              <w:rPr>
+                <w:i/>
+                <w:iCs/>
+                <w:sz w:val="20"/>
+                <w:szCs w:val="20"/>
+              </w:rPr>
+              <w:t>"</w:t>
             </w:r>
           </w:p>
         </w:tc>
@@ -4978,7 +5041,17 @@
                 <w:sz w:val="20"/>
                 <w:szCs w:val="20"/>
               </w:rPr>
-              <w:t>✔ BILHETE / PASSAGEM</w:t>
+              <w:t xml:space="preserve">✔ </w:t>
+            </w:r>
+            <w:r>
+              <w:rPr>
+                <w:b/>
+                <w:bCs/>
+                <w:color w:val="2E7D32"/>
+                <w:sz w:val="20"/>
+                <w:szCs w:val="20"/>
+              </w:rPr>
+              <w:t>BENEFÍCIOS TARIFÁRIOS</w:t>
             </w:r>
           </w:p>
         </w:tc>
@@ -5037,50 +5110,28 @@
             </w:pPr>
             <w:r>
               <w:rPr>
+                <w:rFonts w:ascii="Segoe UI Symbol" w:hAnsi="Segoe UI Symbol" w:cs="Segoe UI Symbol"/>
                 <w:color w:val="B71C1C"/>
                 <w:sz w:val="20"/>
                 <w:szCs w:val="20"/>
               </w:rPr>
-              <w:t>✘ Pix recusado</w:t>
-            </w:r>
-          </w:p>
-          <w:p>
-            <w:pPr>
-              <w:spacing w:after="40"/>
-            </w:pPr>
+              <w:t>✘</w:t>
+            </w:r>
             <w:r>
               <w:rPr>
                 <w:color w:val="B71C1C"/>
                 <w:sz w:val="20"/>
                 <w:szCs w:val="20"/>
               </w:rPr>
-              <w:t>✘ Dinheiro recusado</w:t>
-            </w:r>
-          </w:p>
-          <w:p>
-            <w:pPr>
-              <w:spacing w:after="40"/>
-            </w:pPr>
+              <w:t xml:space="preserve"> </w:t>
+            </w:r>
             <w:r>
               <w:rPr>
                 <w:color w:val="B71C1C"/>
                 <w:sz w:val="20"/>
                 <w:szCs w:val="20"/>
               </w:rPr>
-              <w:t>✘ Perda salarial</w:t>
-            </w:r>
-          </w:p>
-          <w:p>
-            <w:pPr>
-              <w:spacing w:after="40"/>
-            </w:pPr>
-            <w:r>
-              <w:rPr>
-                <w:color w:val="B71C1C"/>
-                <w:sz w:val="20"/>
-                <w:szCs w:val="20"/>
-              </w:rPr>
-              <w:t>✘ Dano financeiro</w:t>
+              <w:t>ATENDIMENTO AO USUÁRIO</w:t>
             </w:r>
           </w:p>
         </w:tc>
@@ -5142,7 +5193,49 @@
                 <w:sz w:val="20"/>
                 <w:szCs w:val="20"/>
               </w:rPr>
-              <w:t>Todas as etapas narradas referem-se ao mesmo fato gerador: a impossibilidade de compra da passagem. As recusas sucessivas e o prejuízo são circunstâncias e consequências do mesmo evento. Nota: avaliar se a orientação contraditória configura nova conduta de atendimento apurável.</w:t>
+              <w:t xml:space="preserve">Todas as etapas narradas referem-se ao mesmo fato gerador: a impossibilidade de </w:t>
+            </w:r>
+            <w:r>
+              <w:rPr>
+                <w:sz w:val="20"/>
+                <w:szCs w:val="20"/>
+              </w:rPr>
+              <w:t>conseguir o benefício tarifário</w:t>
+            </w:r>
+            <w:r>
+              <w:rPr>
+                <w:sz w:val="20"/>
+                <w:szCs w:val="20"/>
+              </w:rPr>
+              <w:t xml:space="preserve">. As recusas sucessivas e o prejuízo são circunstâncias e consequências do mesmo evento. Nota: avaliar se </w:t>
+            </w:r>
+            <w:r>
+              <w:rPr>
+                <w:sz w:val="20"/>
+                <w:szCs w:val="20"/>
+              </w:rPr>
+              <w:t xml:space="preserve">houve </w:t>
+            </w:r>
+            <w:r>
+              <w:rPr>
+                <w:sz w:val="20"/>
+                <w:szCs w:val="20"/>
+              </w:rPr>
+              <w:t>orientação contraditória configura</w:t>
+            </w:r>
+            <w:r>
+              <w:rPr>
+                <w:sz w:val="20"/>
+                <w:szCs w:val="20"/>
+              </w:rPr>
+              <w:t>ndo</w:t>
+            </w:r>
+            <w:r>
+              <w:rPr>
+                <w:sz w:val="20"/>
+                <w:szCs w:val="20"/>
+              </w:rPr>
+              <w:t xml:space="preserve"> nova conduta de atendimento apurável.</w:t>
             </w:r>
           </w:p>
         </w:tc>
@@ -5357,11 +5450,6 @@
     </w:tbl>
     <w:p>
       <w:pPr>
-        <w:spacing w:after="240"/>
-      </w:pPr>
-    </w:p>
-    <w:p>
-      <w:pPr>
         <w:rPr>
           <w:b/>
           <w:bCs/>
@@ -5371,22 +5459,15 @@
           <w:szCs w:val="30"/>
         </w:rPr>
       </w:pPr>
+    </w:p>
+    <w:p>
+      <w:pPr>
+        <w:pStyle w:val="Ttulo1"/>
+      </w:pPr>
       <w:r>
         <w:rPr>
           <w:caps/>
         </w:rPr>
-        <w:br w:type="page"/>
-      </w:r>
-    </w:p>
-    <w:p>
-      <w:pPr>
-        <w:pStyle w:val="Ttulo1"/>
-      </w:pPr>
-      <w:r>
-        <w:rPr>
-          <w:caps/>
-        </w:rPr>
-        <w:lastRenderedPageBreak/>
         <w:t>7. Matriz de Decisão Resumida</w:t>
       </w:r>
     </w:p>
@@ -5901,6 +5982,7 @@
         <w:rPr>
           <w:caps/>
         </w:rPr>
+        <w:lastRenderedPageBreak/>
         <w:t>8. Princípio Operacional do Manual</w:t>
       </w:r>
     </w:p>

</xml_diff>

<commit_message>
docs: update guia operacional de contagem e manual de reclamações
Co-Authored-By: Claude Sonnet 4.6 <noreply@anthropic.com>
</commit_message>
<xml_diff>
--- a/Manual_Contagem de Reclamações.docx
+++ b/Manual_Contagem de Reclamações.docx
@@ -290,7 +290,21 @@
         <w:rPr>
           <w:color w:val="000000"/>
         </w:rPr>
-        <w:t>Antes de criar uma nova categorização, o analista deve se fazer a seguinte pergunta:</w:t>
+        <w:t xml:space="preserve">Antes de </w:t>
+      </w:r>
+      <w:proofErr w:type="gramStart"/>
+      <w:r>
+        <w:rPr>
+          <w:color w:val="000000"/>
+        </w:rPr>
+        <w:t>criar uma nova</w:t>
+      </w:r>
+      <w:proofErr w:type="gramEnd"/>
+      <w:r>
+        <w:rPr>
+          <w:color w:val="000000"/>
+        </w:rPr>
+        <w:t xml:space="preserve"> categorização, o analista deve se fazer a seguinte pergunta:</w:t>
       </w:r>
     </w:p>
     <w:tbl>
@@ -1768,7 +1782,35 @@
         <w:rPr>
           <w:color w:val="000000"/>
         </w:rPr>
-        <w:t>Não se cria nova reclamação porque o cidadão sofreu mais danos. Cria-se nova reclamação quando a empresa pratica novo comportamento apurável.</w:t>
+        <w:t xml:space="preserve">Não se </w:t>
+      </w:r>
+      <w:proofErr w:type="gramStart"/>
+      <w:r>
+        <w:rPr>
+          <w:color w:val="000000"/>
+        </w:rPr>
+        <w:t>cria nova</w:t>
+      </w:r>
+      <w:proofErr w:type="gramEnd"/>
+      <w:r>
+        <w:rPr>
+          <w:color w:val="000000"/>
+        </w:rPr>
+        <w:t xml:space="preserve"> reclamação porque o cidadão sofreu mais danos. </w:t>
+      </w:r>
+      <w:proofErr w:type="gramStart"/>
+      <w:r>
+        <w:rPr>
+          <w:color w:val="000000"/>
+        </w:rPr>
+        <w:t>Cria-se nova</w:t>
+      </w:r>
+      <w:proofErr w:type="gramEnd"/>
+      <w:r>
+        <w:rPr>
+          <w:color w:val="000000"/>
+        </w:rPr>
+        <w:t xml:space="preserve"> reclamação quando a empresa pratica novo comportamento apurável.</w:t>
       </w:r>
     </w:p>
     <w:p>
@@ -6155,7 +6197,37 @@
           <w:sz w:val="18"/>
           <w:szCs w:val="18"/>
         </w:rPr>
-        <w:t>Manual de Ouvidoria — Categorização de Reclamações</w:t>
+        <w:t xml:space="preserve">Manual de Ouvidoria — </w:t>
+      </w:r>
+      <w:r>
+        <w:rPr>
+          <w:i/>
+          <w:iCs/>
+          <w:color w:val="888888"/>
+          <w:sz w:val="18"/>
+          <w:szCs w:val="18"/>
+        </w:rPr>
+        <w:t>Classificação</w:t>
+      </w:r>
+      <w:r>
+        <w:rPr>
+          <w:i/>
+          <w:iCs/>
+          <w:color w:val="888888"/>
+          <w:sz w:val="18"/>
+          <w:szCs w:val="18"/>
+        </w:rPr>
+        <w:t xml:space="preserve"> de </w:t>
+      </w:r>
+      <w:r>
+        <w:rPr>
+          <w:i/>
+          <w:iCs/>
+          <w:color w:val="888888"/>
+          <w:sz w:val="18"/>
+          <w:szCs w:val="18"/>
+        </w:rPr>
+        <w:t>Manifestações</w:t>
       </w:r>
     </w:p>
     <w:sectPr>

</xml_diff>